<commit_message>
Align job titles with section left margin on CV and industry resume.
Replace title/date tables with float and Flowable layouts so entry titles no longer overhang past Summary and Experience.

Co-authored-by: Cursor <cursoragent@cursor.com>
</commit_message>
<xml_diff>
--- a/resume/Md_Ashikur_Rahman_Industry_Resume.docx
+++ b/resume/Md_Ashikur_Rahman_Industry_Resume.docx
@@ -147,6 +147,7 @@
     <w:p>
       <w:pPr>
         <w:spacing w:before="160" w:after="40" w:line="264" w:lineRule="auto"/>
+        <w:ind w:left="0" w:firstLine="0"/>
         <w:pBdr>
           <w:bottom w:val="single" w:sz="6" w:space="1" w:color="E4EAEE"/>
         </w:pBdr>
@@ -164,6 +165,7 @@
     <w:p>
       <w:pPr>
         <w:spacing w:before="40" w:after="80" w:line="276" w:lineRule="auto"/>
+        <w:ind w:left="0" w:firstLine="0"/>
         <w:jc w:val="left"/>
       </w:pPr>
       <w:r>
@@ -179,6 +181,7 @@
     <w:p>
       <w:pPr>
         <w:spacing w:before="160" w:after="40" w:line="264" w:lineRule="auto"/>
+        <w:ind w:left="0" w:firstLine="0"/>
         <w:pBdr>
           <w:bottom w:val="single" w:sz="6" w:space="1" w:color="E4EAEE"/>
         </w:pBdr>
@@ -199,6 +202,7 @@
           <w:tab w:pos="10080" w:val="right"/>
         </w:tabs>
         <w:spacing w:before="80" w:after="20" w:line="264" w:lineRule="auto"/>
+        <w:ind w:left="0" w:firstLine="0"/>
       </w:pPr>
       <w:r>
         <w:rPr>
@@ -224,9 +228,8 @@
     </w:p>
     <w:p>
       <w:pPr>
-        <w:pStyle w:val="ListBullet"/>
         <w:spacing w:before="0" w:after="20" w:line="276" w:lineRule="auto"/>
-        <w:ind w:left="288"/>
+        <w:ind w:left="259" w:firstLine="0"/>
       </w:pPr>
       <w:r>
         <w:rPr>
@@ -235,14 +238,13 @@
           <w:color w:val="222222"/>
           <w:sz w:val="19"/>
         </w:rPr>
-        <w:t>Lead a multidisciplinary team of 15+ ML engineers, software engineers, and researchers across architecture, planning, code review, and delivery; maintain 90-95% on-time delivery across AI engineering projects.</w:t>
+        <w:t>• Lead a multidisciplinary team of 15+ ML engineers, software engineers, and researchers across architecture, planning, code review, and delivery; maintain 90-95% on-time delivery across AI engineering projects.</w:t>
       </w:r>
     </w:p>
     <w:p>
       <w:pPr>
-        <w:pStyle w:val="ListBullet"/>
         <w:spacing w:before="0" w:after="20" w:line="276" w:lineRule="auto"/>
-        <w:ind w:left="288"/>
+        <w:ind w:left="259" w:firstLine="0"/>
       </w:pPr>
       <w:r>
         <w:rPr>
@@ -251,14 +253,13 @@
           <w:color w:val="222222"/>
           <w:sz w:val="19"/>
         </w:rPr>
-        <w:t>Oversee development of production AI systems across virtual try-on, generative media, 3D reconstruction, catalog audit, and audio QA.</w:t>
+        <w:t>• Oversee development of production AI systems across virtual try-on, generative media, 3D reconstruction, catalog audit, and audio QA.</w:t>
       </w:r>
     </w:p>
     <w:p>
       <w:pPr>
-        <w:pStyle w:val="ListBullet"/>
         <w:spacing w:before="0" w:after="20" w:line="276" w:lineRule="auto"/>
-        <w:ind w:left="288"/>
+        <w:ind w:left="259" w:firstLine="0"/>
       </w:pPr>
       <w:r>
         <w:rPr>
@@ -267,14 +268,13 @@
           <w:color w:val="222222"/>
           <w:sz w:val="19"/>
         </w:rPr>
-        <w:t>Direct applied research on AI hallucination, prompt safety, visual grounding, and video understanding.</w:t>
+        <w:t>• Direct applied research on AI hallucination, prompt safety, visual grounding, and video understanding.</w:t>
       </w:r>
     </w:p>
     <w:p>
       <w:pPr>
-        <w:pStyle w:val="ListBullet"/>
         <w:spacing w:before="0" w:after="20" w:line="276" w:lineRule="auto"/>
-        <w:ind w:left="288"/>
+        <w:ind w:left="259" w:firstLine="0"/>
       </w:pPr>
       <w:r>
         <w:rPr>
@@ -283,7 +283,7 @@
           <w:color w:val="222222"/>
           <w:sz w:val="19"/>
         </w:rPr>
-        <w:t>Develop and scale production segmentation and image-processing systems, including Retouched.ai; publish reproducible research code, datasets, and model artifacts on GitHub and Hugging Face.</w:t>
+        <w:t>• Develop and scale production segmentation and image-processing systems, including Retouched.ai; publish reproducible research code, datasets, and model artifacts on GitHub and Hugging Face.</w:t>
       </w:r>
     </w:p>
     <w:p>
@@ -292,6 +292,7 @@
           <w:tab w:pos="10080" w:val="right"/>
         </w:tabs>
         <w:spacing w:before="80" w:after="20" w:line="264" w:lineRule="auto"/>
+        <w:ind w:left="0" w:firstLine="0"/>
       </w:pPr>
       <w:r>
         <w:rPr>
@@ -317,9 +318,8 @@
     </w:p>
     <w:p>
       <w:pPr>
-        <w:pStyle w:val="ListBullet"/>
         <w:spacing w:before="0" w:after="20" w:line="276" w:lineRule="auto"/>
-        <w:ind w:left="288"/>
+        <w:ind w:left="259" w:firstLine="0"/>
       </w:pPr>
       <w:r>
         <w:rPr>
@@ -328,14 +328,13 @@
           <w:color w:val="222222"/>
           <w:sz w:val="19"/>
         </w:rPr>
-        <w:t>Improved object detection and segmentation performance by 20-35% across internal evaluation benchmarks; the resulting models were later deployed through Retouched.ai.</w:t>
+        <w:t>• Improved object detection and segmentation performance by 20-35% across internal evaluation benchmarks; the resulting models were later deployed through Retouched.ai.</w:t>
       </w:r>
     </w:p>
     <w:p>
       <w:pPr>
-        <w:pStyle w:val="ListBullet"/>
         <w:spacing w:before="0" w:after="20" w:line="276" w:lineRule="auto"/>
-        <w:ind w:left="288"/>
+        <w:ind w:left="259" w:firstLine="0"/>
       </w:pPr>
       <w:r>
         <w:rPr>
@@ -344,7 +343,7 @@
           <w:color w:val="222222"/>
           <w:sz w:val="19"/>
         </w:rPr>
-        <w:t>Led 6+ client ML engagements from business requirements to technical delivery; built offline evaluation pipelines and production A/B testing workflows to validate model quality, inference performance, and production outcomes.</w:t>
+        <w:t>• Led 6+ client ML engagements from business requirements to technical delivery; built offline evaluation pipelines and production A/B testing workflows to validate model quality, inference performance, and production outcomes.</w:t>
       </w:r>
     </w:p>
     <w:p>
@@ -353,6 +352,7 @@
           <w:tab w:pos="10080" w:val="right"/>
         </w:tabs>
         <w:spacing w:before="80" w:after="20" w:line="264" w:lineRule="auto"/>
+        <w:ind w:left="0" w:firstLine="0"/>
       </w:pPr>
       <w:r>
         <w:rPr>
@@ -378,9 +378,8 @@
     </w:p>
     <w:p>
       <w:pPr>
-        <w:pStyle w:val="ListBullet"/>
         <w:spacing w:before="0" w:after="20" w:line="276" w:lineRule="auto"/>
-        <w:ind w:left="288"/>
+        <w:ind w:left="259" w:firstLine="0"/>
       </w:pPr>
       <w:r>
         <w:rPr>
@@ -389,7 +388,7 @@
           <w:color w:val="222222"/>
           <w:sz w:val="19"/>
         </w:rPr>
-        <w:t>Built deep learning models for production object recognition, image segmentation, and background-removal workflows; developed scalable preprocessing, training, and A/B testing pipelines.</w:t>
+        <w:t>• Built deep learning models for production object recognition, image segmentation, and background-removal workflows; developed scalable preprocessing, training, and A/B testing pipelines.</w:t>
       </w:r>
     </w:p>
     <w:p>
@@ -398,6 +397,7 @@
           <w:tab w:pos="10080" w:val="right"/>
         </w:tabs>
         <w:spacing w:before="80" w:after="20" w:line="264" w:lineRule="auto"/>
+        <w:ind w:left="0" w:firstLine="0"/>
       </w:pPr>
       <w:r>
         <w:rPr>
@@ -423,9 +423,8 @@
     </w:p>
     <w:p>
       <w:pPr>
-        <w:pStyle w:val="ListBullet"/>
         <w:spacing w:before="0" w:after="20" w:line="276" w:lineRule="auto"/>
-        <w:ind w:left="288"/>
+        <w:ind w:left="259" w:firstLine="0"/>
       </w:pPr>
       <w:r>
         <w:rPr>
@@ -434,14 +433,13 @@
           <w:color w:val="222222"/>
           <w:sz w:val="19"/>
         </w:rPr>
-        <w:t>Led .NET and SQL Server supply-chain systems on a 4 TB database, reducing report generation from 20 minutes to 40-54 seconds.</w:t>
+        <w:t>• Led .NET and SQL Server supply-chain systems on a 4 TB database, reducing report generation from 20 minutes to 40-54 seconds.</w:t>
       </w:r>
     </w:p>
     <w:p>
       <w:pPr>
-        <w:pStyle w:val="ListBullet"/>
         <w:spacing w:before="0" w:after="20" w:line="276" w:lineRule="auto"/>
-        <w:ind w:left="288"/>
+        <w:ind w:left="259" w:firstLine="0"/>
       </w:pPr>
       <w:r>
         <w:rPr>
@@ -450,7 +448,7 @@
           <w:color w:val="222222"/>
           <w:sz w:val="19"/>
         </w:rPr>
-        <w:t>Achieved 70-75% process automation and 99.9% synchronization success for offline-capable enterprise workflows.</w:t>
+        <w:t>• Achieved 70-75% process automation and 99.9% synchronization success for offline-capable enterprise workflows.</w:t>
       </w:r>
     </w:p>
     <w:p>
@@ -459,6 +457,7 @@
           <w:tab w:pos="10080" w:val="right"/>
         </w:tabs>
         <w:spacing w:before="80" w:after="20" w:line="264" w:lineRule="auto"/>
+        <w:ind w:left="0" w:firstLine="0"/>
       </w:pPr>
       <w:r>
         <w:rPr>
@@ -484,9 +483,8 @@
     </w:p>
     <w:p>
       <w:pPr>
-        <w:pStyle w:val="ListBullet"/>
         <w:spacing w:before="0" w:after="20" w:line="276" w:lineRule="auto"/>
-        <w:ind w:left="288"/>
+        <w:ind w:left="259" w:firstLine="0"/>
       </w:pPr>
       <w:r>
         <w:rPr>
@@ -495,12 +493,13 @@
           <w:color w:val="222222"/>
           <w:sz w:val="19"/>
         </w:rPr>
-        <w:t>Developed ASP.NET MVC features, backend services, and database integrations for DevSkill.com.</w:t>
+        <w:t>• Developed ASP.NET MVC features, backend services, and database integrations for DevSkill.com.</w:t>
       </w:r>
     </w:p>
     <w:p>
       <w:pPr>
         <w:spacing w:before="160" w:after="40" w:line="264" w:lineRule="auto"/>
+        <w:ind w:left="0" w:firstLine="0"/>
         <w:pBdr>
           <w:bottom w:val="single" w:sz="6" w:space="1" w:color="E4EAEE"/>
         </w:pBdr>
@@ -521,6 +520,7 @@
           <w:tab w:pos="10080" w:val="right"/>
         </w:tabs>
         <w:spacing w:before="80" w:after="20" w:line="264" w:lineRule="auto"/>
+        <w:ind w:left="0" w:firstLine="0"/>
       </w:pPr>
       <w:r>
         <w:rPr>
@@ -546,9 +546,8 @@
     </w:p>
     <w:p>
       <w:pPr>
-        <w:pStyle w:val="ListBullet"/>
         <w:spacing w:before="0" w:after="20" w:line="276" w:lineRule="auto"/>
-        <w:ind w:left="288"/>
+        <w:ind w:left="259" w:firstLine="0"/>
       </w:pPr>
       <w:r>
         <w:rPr>
@@ -557,14 +556,13 @@
           <w:color w:val="222222"/>
           <w:sz w:val="19"/>
         </w:rPr>
-        <w:t>Developed production salient-object segmentation for background removal; improved segmentation quality by 17% on internal benchmarks, reduced processing time by 30%, supported uploads up to 257 MB, and achieved a 2.27-second average processing time across standard production workloads.</w:t>
+        <w:t>• Developed production salient-object segmentation for background removal; improved segmentation quality by 17% on internal benchmarks, reduced processing time by 30%, supported uploads up to 257 MB, and achieved a 2.27-second average processing time across standard production workloads.</w:t>
       </w:r>
     </w:p>
     <w:p>
       <w:pPr>
-        <w:pStyle w:val="ListBullet"/>
         <w:spacing w:before="0" w:after="20" w:line="276" w:lineRule="auto"/>
-        <w:ind w:left="288"/>
+        <w:ind w:left="259" w:firstLine="0"/>
       </w:pPr>
       <w:r>
         <w:rPr>
@@ -573,7 +571,7 @@
           <w:color w:val="222222"/>
           <w:sz w:val="19"/>
         </w:rPr>
-        <w:t>Scaled Retouched.ai to process 4.5M+ images globally for hundreds of customers using PyTorch, U²-Net-inspired salient-object segmentation, FastAPI, and Google Cloud Platform.</w:t>
+        <w:t>• Scaled Retouched.ai to process 4.5M+ images globally for hundreds of customers using PyTorch, U²-Net-inspired salient-object segmentation, FastAPI, and Google Cloud Platform.</w:t>
       </w:r>
     </w:p>
     <w:p>
@@ -582,6 +580,7 @@
           <w:tab w:pos="10080" w:val="right"/>
         </w:tabs>
         <w:spacing w:before="80" w:after="20" w:line="264" w:lineRule="auto"/>
+        <w:ind w:left="0" w:firstLine="0"/>
       </w:pPr>
       <w:r>
         <w:rPr>
@@ -607,9 +606,8 @@
     </w:p>
     <w:p>
       <w:pPr>
-        <w:pStyle w:val="ListBullet"/>
         <w:spacing w:before="0" w:after="20" w:line="276" w:lineRule="auto"/>
-        <w:ind w:left="288"/>
+        <w:ind w:left="259" w:firstLine="0"/>
       </w:pPr>
       <w:r>
         <w:rPr>
@@ -618,14 +616,13 @@
           <w:color w:val="222222"/>
           <w:sz w:val="19"/>
         </w:rPr>
-        <w:t>Co-designed and launched production image- and video-generation APIs used across 200+ brands for creative and product-image workflows.</w:t>
+        <w:t>• Co-designed and launched production image- and video-generation APIs used across 200+ brands for creative and product-image workflows.</w:t>
       </w:r>
     </w:p>
     <w:p>
       <w:pPr>
-        <w:pStyle w:val="ListBullet"/>
         <w:spacing w:before="0" w:after="20" w:line="276" w:lineRule="auto"/>
-        <w:ind w:left="288"/>
+        <w:ind w:left="259" w:firstLine="0"/>
       </w:pPr>
       <w:r>
         <w:rPr>
@@ -634,7 +631,7 @@
           <w:color w:val="222222"/>
           <w:sz w:val="19"/>
         </w:rPr>
-        <w:t>Built workflows for reference-image conditioning, asynchronous processing, prompt classification, intent routing, and automated model selection.</w:t>
+        <w:t>• Built workflows for reference-image conditioning, asynchronous processing, prompt classification, intent routing, and automated model selection.</w:t>
       </w:r>
     </w:p>
     <w:p>
@@ -643,6 +640,7 @@
           <w:tab w:pos="10080" w:val="right"/>
         </w:tabs>
         <w:spacing w:before="80" w:after="20" w:line="264" w:lineRule="auto"/>
+        <w:ind w:left="0" w:firstLine="0"/>
       </w:pPr>
       <w:r>
         <w:rPr>
@@ -668,9 +666,8 @@
     </w:p>
     <w:p>
       <w:pPr>
-        <w:pStyle w:val="ListBullet"/>
         <w:spacing w:before="0" w:after="20" w:line="276" w:lineRule="auto"/>
-        <w:ind w:left="288"/>
+        <w:ind w:left="259" w:firstLine="0"/>
       </w:pPr>
       <w:r>
         <w:rPr>
@@ -679,14 +676,13 @@
           <w:color w:val="222222"/>
           <w:sz w:val="19"/>
         </w:rPr>
-        <w:t>Conceived and co-led a unified cross-brand virtual try-on platform covering 170+ brands.</w:t>
+        <w:t>• Conceived and co-led a unified cross-brand virtual try-on platform covering 170+ brands.</w:t>
       </w:r>
     </w:p>
     <w:p>
       <w:pPr>
-        <w:pStyle w:val="ListBullet"/>
         <w:spacing w:before="0" w:after="20" w:line="276" w:lineRule="auto"/>
-        <w:ind w:left="288"/>
+        <w:ind w:left="259" w:firstLine="0"/>
       </w:pPr>
       <w:r>
         <w:rPr>
@@ -695,7 +691,7 @@
           <w:color w:val="222222"/>
           <w:sz w:val="19"/>
         </w:rPr>
-        <w:t>Architected a Dockerized FastAPI/Nginx backend using SQL Server, Google Cloud Storage, Redis, recommendation services, and 2D virtual try-on pipelines.</w:t>
+        <w:t>• Architected a Dockerized FastAPI/Nginx backend using SQL Server, Google Cloud Storage, Redis, recommendation services, and 2D virtual try-on pipelines.</w:t>
       </w:r>
     </w:p>
     <w:p>
@@ -704,6 +700,7 @@
           <w:tab w:pos="10080" w:val="right"/>
         </w:tabs>
         <w:spacing w:before="80" w:after="20" w:line="264" w:lineRule="auto"/>
+        <w:ind w:left="0" w:firstLine="0"/>
       </w:pPr>
       <w:r>
         <w:rPr>
@@ -729,9 +726,8 @@
     </w:p>
     <w:p>
       <w:pPr>
-        <w:pStyle w:val="ListBullet"/>
         <w:spacing w:before="0" w:after="20" w:line="276" w:lineRule="auto"/>
-        <w:ind w:left="288"/>
+        <w:ind w:left="259" w:firstLine="0"/>
       </w:pPr>
       <w:r>
         <w:rPr>
@@ -740,14 +736,13 @@
           <w:color w:val="222222"/>
           <w:sz w:val="19"/>
         </w:rPr>
-        <w:t>Lead development of an AI catalog-audit and image quality assurance platform for a major US retail client.</w:t>
+        <w:t>• Lead development of an AI catalog-audit and image quality assurance platform for a major US retail client.</w:t>
       </w:r>
     </w:p>
     <w:p>
       <w:pPr>
-        <w:pStyle w:val="ListBullet"/>
         <w:spacing w:before="0" w:after="20" w:line="276" w:lineRule="auto"/>
-        <w:ind w:left="288"/>
+        <w:ind w:left="259" w:firstLine="0"/>
       </w:pPr>
       <w:r>
         <w:rPr>
@@ -756,7 +751,7 @@
           <w:color w:val="222222"/>
           <w:sz w:val="19"/>
         </w:rPr>
-        <w:t>Automate image QA, catalog validation, metadata checks, and content-health monitoring across DAM and CMS workflows using computer vision, NLP, PyTorch, and FastAPI.</w:t>
+        <w:t>• Automate image QA, catalog validation, metadata checks, and content-health monitoring across DAM and CMS workflows using computer vision, NLP, PyTorch, and FastAPI.</w:t>
       </w:r>
     </w:p>
     <w:p>
@@ -765,6 +760,7 @@
           <w:tab w:pos="10080" w:val="right"/>
         </w:tabs>
         <w:spacing w:before="80" w:after="20" w:line="264" w:lineRule="auto"/>
+        <w:ind w:left="0" w:firstLine="0"/>
       </w:pPr>
       <w:r>
         <w:rPr>
@@ -790,9 +786,8 @@
     </w:p>
     <w:p>
       <w:pPr>
-        <w:pStyle w:val="ListBullet"/>
         <w:spacing w:before="0" w:after="20" w:line="276" w:lineRule="auto"/>
-        <w:ind w:left="288"/>
+        <w:ind w:left="259" w:firstLine="0"/>
       </w:pPr>
       <w:r>
         <w:rPr>
@@ -801,14 +796,13 @@
           <w:color w:val="222222"/>
           <w:sz w:val="19"/>
         </w:rPr>
-        <w:t>Leading early-stage R&amp;D for a proprietary multimodal image-generation and editing system for product-visualization workflows.</w:t>
+        <w:t>• Leading early-stage R&amp;D for a proprietary multimodal image-generation and editing system for product-visualization workflows.</w:t>
       </w:r>
     </w:p>
     <w:p>
       <w:pPr>
-        <w:pStyle w:val="ListBullet"/>
         <w:spacing w:before="0" w:after="20" w:line="276" w:lineRule="auto"/>
-        <w:ind w:left="288"/>
+        <w:ind w:left="259" w:firstLine="0"/>
       </w:pPr>
       <w:r>
         <w:rPr>
@@ -817,7 +811,7 @@
           <w:color w:val="222222"/>
           <w:sz w:val="19"/>
         </w:rPr>
-        <w:t>Researching and prototyping multi-reference fusion and prompt-guided image-editing workflows for garment replacement, scene composition, product visualization, and style transfer using PyTorch, Diffusers, ComfyUI, and parameter-efficient fine-tuning (LoRA, QLoRA).</w:t>
+        <w:t>• Researching and prototyping multi-reference fusion and prompt-guided image-editing workflows for garment replacement, scene composition, product visualization, and style transfer using PyTorch, Diffusers, ComfyUI, and parameter-efficient fine-tuning (LoRA, QLoRA).</w:t>
       </w:r>
     </w:p>
     <w:p>
@@ -828,6 +822,7 @@
     <w:p>
       <w:pPr>
         <w:spacing w:before="160" w:after="40" w:line="264" w:lineRule="auto"/>
+        <w:ind w:left="0" w:firstLine="0"/>
         <w:pBdr>
           <w:bottom w:val="single" w:sz="6" w:space="1" w:color="E4EAEE"/>
         </w:pBdr>
@@ -844,9 +839,8 @@
     </w:p>
     <w:p>
       <w:pPr>
-        <w:pStyle w:val="ListBullet"/>
-        <w:spacing w:before="0" w:after="20" w:line="276" w:lineRule="auto"/>
-        <w:ind w:left="288"/>
+        <w:spacing w:before="0" w:after="40" w:line="276" w:lineRule="auto"/>
+        <w:ind w:left="0" w:firstLine="0"/>
       </w:pPr>
       <w:r>
         <w:rPr>
@@ -855,28 +849,13 @@
           <w:color w:val="222222"/>
           <w:sz w:val="19"/>
         </w:rPr>
-        <w:t>Stroke-Level Connectivity Verification: Grounding Vision-Language Models Against Topology Hallucination in Diagram Understanding. Accepted for oral presentation at ICDAR 2026; Corresponding Author.</w:t>
-      </w:r>
-    </w:p>
-    <w:p>
-      <w:pPr>
-        <w:pStyle w:val="ListBullet"/>
-        <w:spacing w:before="0" w:after="20" w:line="276" w:lineRule="auto"/>
-        <w:ind w:left="288"/>
-      </w:pPr>
-      <w:r>
-        <w:rPr>
-          <w:rFonts w:ascii="Calibri" w:hAnsi="Calibri" w:eastAsia="Calibri"/>
-          <w:b w:val="0"/>
-          <w:color w:val="222222"/>
-          <w:sz w:val="19"/>
-        </w:rPr>
-        <w:t>Automated Detection of Diabetic Retinopathy using Deep Residual Learning. IJCA, 2020.</w:t>
+        <w:t>[P1] Abdullah Ibne Hanif Arean, Niamul Hassan Samin, Md Arifur Rahman, Renu Akter Sweety, Juena Ahmed Noshin, Md Ashikur Rahman*. "Stroke-Level Connectivity Verification: Grounding Vision-Language Models Against Topology Hallucination in Diagram Understanding." International Conference on Document Analysis and Recognition (ICDAR), 2026. Accepted for oral presentation. *Corresponding author. [Code]</w:t>
       </w:r>
     </w:p>
     <w:p>
       <w:pPr>
         <w:spacing w:before="160" w:after="40" w:line="264" w:lineRule="auto"/>
+        <w:ind w:left="0" w:firstLine="0"/>
         <w:pBdr>
           <w:bottom w:val="single" w:sz="6" w:space="1" w:color="E4EAEE"/>
         </w:pBdr>
@@ -893,9 +872,8 @@
     </w:p>
     <w:p>
       <w:pPr>
-        <w:pStyle w:val="ListBullet"/>
-        <w:spacing w:before="0" w:after="20" w:line="276" w:lineRule="auto"/>
-        <w:ind w:left="288"/>
+        <w:spacing w:before="0" w:after="40" w:line="276" w:lineRule="auto"/>
+        <w:ind w:left="0" w:firstLine="0"/>
       </w:pPr>
       <w:r>
         <w:rPr>
@@ -904,25 +882,13 @@
           <w:color w:val="222222"/>
           <w:sz w:val="19"/>
         </w:rPr>
-        <w:t xml:space="preserve">Step-Level Visual Grounding Faithfulness Predicts Out-of-Distribution Generalization in Long-Horizon Vision-Language Models. arXiv preprint, 2026. Under review. </w:t>
+        <w:t>[M1] Md Ashikur Rahman, Md Arifur Rahman, Niamul Hassan Samin, Khandaker Rifah Tasnia, Sifat Rahman Ahona, Juena Ahmed Noshin. "Beyond Aggregate Risk: Role-Stratified Conformal Risk Control for LLM Tool Calls." Manuscript under review, 2026.</w:t>
       </w:r>
-      <w:hyperlink r:id="rId14">
-        <w:r>
-          <w:rPr>
-            <w:color w:val="9B1B30"/>
-            <w:u w:val="single"/>
-            <w:sz w:val="18"/>
-            <w:rFonts w:ascii="Calibri" w:hAnsi="Calibri"/>
-          </w:rPr>
-          <w:t>arxiv.org/pdf/2603.06828</w:t>
-        </w:r>
-      </w:hyperlink>
     </w:p>
     <w:p>
       <w:pPr>
-        <w:pStyle w:val="ListBullet"/>
-        <w:spacing w:before="0" w:after="20" w:line="276" w:lineRule="auto"/>
-        <w:ind w:left="288"/>
+        <w:spacing w:before="0" w:after="40" w:line="276" w:lineRule="auto"/>
+        <w:ind w:left="0" w:firstLine="0"/>
       </w:pPr>
       <w:r>
         <w:rPr>
@@ -931,23 +897,61 @@
           <w:color w:val="222222"/>
           <w:sz w:val="19"/>
         </w:rPr>
-        <w:t xml:space="preserve">Beyond Dominant Patches: Spatial Credit Redistribution for Grounded Vision-Language Models. arXiv preprint, 2026. Under review. </w:t>
+        <w:t>[M2] Md Ashikur Rahman, Juena Ahmed Noshin, Niamul Hassan Samin, Abdullah Ibne Hanif Arean, Md Hasibul Amin, Md Arifur Rahman. "When Detector-Based Grounding Metrics Measure Vocabulary: A Cautionary Audit of Entity Claims in Video-QA Reasoning Traces." Manuscript under review, 2026.</w:t>
       </w:r>
-      <w:hyperlink r:id="rId15">
-        <w:r>
-          <w:rPr>
-            <w:color w:val="9B1B30"/>
-            <w:u w:val="single"/>
-            <w:sz w:val="18"/>
-            <w:rFonts w:ascii="Calibri" w:hAnsi="Calibri"/>
-          </w:rPr>
-          <w:t>arxiv.org/pdf/2602.22469</w:t>
-        </w:r>
-      </w:hyperlink>
+    </w:p>
+    <w:p>
+      <w:pPr>
+        <w:spacing w:before="0" w:after="40" w:line="276" w:lineRule="auto"/>
+        <w:ind w:left="0" w:firstLine="0"/>
+      </w:pPr>
+      <w:r>
+        <w:rPr>
+          <w:rFonts w:ascii="Calibri" w:hAnsi="Calibri" w:eastAsia="Calibri"/>
+          <w:b w:val="0"/>
+          <w:color w:val="222222"/>
+          <w:sz w:val="19"/>
+        </w:rPr>
+        <w:t>[M3] Md Ashikur Rahman, Md Arifur Rahman, Nusrat Jahan Trisna, Juena Ahmed Noshin. "Math-Encoded Jailbreaks Across Provider-Matched Models and Inference-Time Reasoning Configurations." Manuscript under review, 2026.</w:t>
+      </w:r>
     </w:p>
     <w:p>
       <w:pPr>
         <w:spacing w:before="160" w:after="40" w:line="264" w:lineRule="auto"/>
+        <w:ind w:left="0" w:firstLine="0"/>
+        <w:pBdr>
+          <w:bottom w:val="single" w:sz="6" w:space="1" w:color="E4EAEE"/>
+        </w:pBdr>
+      </w:pPr>
+      <w:r>
+        <w:rPr>
+          <w:rFonts w:ascii="Calibri" w:hAnsi="Calibri" w:eastAsia="Calibri"/>
+          <w:b/>
+          <w:color w:val="00274C"/>
+          <w:sz w:val="22"/>
+        </w:rPr>
+        <w:t>Additional Publication</w:t>
+      </w:r>
+    </w:p>
+    <w:p>
+      <w:pPr>
+        <w:spacing w:before="0" w:after="40" w:line="276" w:lineRule="auto"/>
+        <w:ind w:left="0" w:firstLine="0"/>
+      </w:pPr>
+      <w:r>
+        <w:rPr>
+          <w:rFonts w:ascii="Calibri" w:hAnsi="Calibri" w:eastAsia="Calibri"/>
+          <w:b w:val="0"/>
+          <w:color w:val="222222"/>
+          <w:sz w:val="19"/>
+        </w:rPr>
+        <w:t>[A1] "Automated Detection of Diabetic Retinopathy Using Deep Residual Learning." International Journal of Computer Applications, 2020.</w:t>
+      </w:r>
+    </w:p>
+    <w:p>
+      <w:pPr>
+        <w:spacing w:before="160" w:after="40" w:line="264" w:lineRule="auto"/>
+        <w:ind w:left="0" w:firstLine="0"/>
         <w:pBdr>
           <w:bottom w:val="single" w:sz="6" w:space="1" w:color="E4EAEE"/>
         </w:pBdr>
@@ -979,6 +983,7 @@
     <w:p>
       <w:pPr>
         <w:spacing w:before="80" w:after="20" w:line="264" w:lineRule="auto"/>
+        <w:ind w:left="0" w:firstLine="0"/>
       </w:pPr>
       <w:r>
         <w:rPr>
@@ -1021,6 +1026,7 @@
     <w:p>
       <w:pPr>
         <w:spacing w:before="160" w:after="40" w:line="264" w:lineRule="auto"/>
+        <w:ind w:left="0" w:firstLine="0"/>
         <w:pBdr>
           <w:bottom w:val="single" w:sz="6" w:space="1" w:color="E4EAEE"/>
         </w:pBdr>
@@ -1037,9 +1043,8 @@
     </w:p>
     <w:p>
       <w:pPr>
-        <w:pStyle w:val="ListBullet"/>
         <w:spacing w:before="0" w:after="20" w:line="276" w:lineRule="auto"/>
-        <w:ind w:left="288"/>
+        <w:ind w:left="259" w:firstLine="0"/>
       </w:pPr>
       <w:r>
         <w:rPr>
@@ -1048,12 +1053,13 @@
           <w:color w:val="222222"/>
           <w:sz w:val="19"/>
         </w:rPr>
-        <w:t>Champion, BASIS National ICT Awards 2020 (Retouched.ai); Finalist, APICTA 2021</w:t>
+        <w:t>• Champion, BASIS National ICT Awards 2020 (Retouched.ai); Finalist, APICTA 2021</w:t>
       </w:r>
     </w:p>
     <w:p>
       <w:pPr>
         <w:spacing w:before="160" w:after="40" w:line="264" w:lineRule="auto"/>
+        <w:ind w:left="0" w:firstLine="0"/>
         <w:pBdr>
           <w:bottom w:val="single" w:sz="6" w:space="1" w:color="E4EAEE"/>
         </w:pBdr>
@@ -1070,9 +1076,8 @@
     </w:p>
     <w:p>
       <w:pPr>
-        <w:pStyle w:val="ListBullet"/>
         <w:spacing w:before="0" w:after="20" w:line="276" w:lineRule="auto"/>
-        <w:ind w:left="288"/>
+        <w:ind w:left="259" w:firstLine="0"/>
       </w:pPr>
       <w:r>
         <w:rPr>
@@ -1081,12 +1086,13 @@
           <w:color w:val="222222"/>
           <w:sz w:val="19"/>
         </w:rPr>
-        <w:t>Bengali (Native); English (Professional working proficiency)</w:t>
+        <w:t>• Bengali (Native); English (Professional working proficiency)</w:t>
       </w:r>
     </w:p>
     <w:p>
       <w:pPr>
         <w:spacing w:before="160" w:after="40" w:line="264" w:lineRule="auto"/>
+        <w:ind w:left="0" w:firstLine="0"/>
         <w:pBdr>
           <w:bottom w:val="single" w:sz="6" w:space="1" w:color="E4EAEE"/>
         </w:pBdr>

</xml_diff>

<commit_message>
Update publications, resume wording, and site to match latest CV.
Refresh peer-reviewed and under-review entries, tighten industry summary and experience language, and keep the homepage aligned with both resumes.

Co-authored-by: Cursor <cursoragent@cursor.com>
</commit_message>
<xml_diff>
--- a/resume/Md_Ashikur_Rahman_Industry_Resume.docx
+++ b/resume/Md_Ashikur_Rahman_Industry_Resume.docx
@@ -29,7 +29,7 @@
           <w:color w:val="00274C"/>
           <w:sz w:val="20"/>
         </w:rPr>
-        <w:t>Lead AI Engineer | Multimodal AI, Generative AI, and Production Computer Vision</w:t>
+        <w:t>Lead AI Engineer | Multimodal AI, Generative AI &amp; Applied Computer Vision</w:t>
       </w:r>
     </w:p>
     <w:p>
@@ -175,7 +175,7 @@
           <w:color w:val="222222"/>
           <w:sz w:val="19"/>
         </w:rPr>
-        <w:t>Lead AI Engineer specializing in multimodal AI, vision-language systems, generative AI, and production computer vision. Lead 15+ engineers and researchers across applied research, product development, and enterprise delivery. Built and scaled production AI systems supporting 200+ brands, including computer-vision platforms that have processed 4.5M+ images globally.</w:t>
+        <w:t>Lead AI Engineer specializing in multimodal AI, vision-language systems, generative AI, and applied computer vision. Currently lead a multidisciplinary team of 15+ engineers and researchers and deliver enterprise AI products used by 200+ brands. Architected computer-vision systems that have processed more than 4.5 million images globally.</w:t>
       </w:r>
     </w:p>
     <w:p>
@@ -238,7 +238,7 @@
           <w:color w:val="222222"/>
           <w:sz w:val="19"/>
         </w:rPr>
-        <w:t>• Lead a multidisciplinary team of 15+ ML engineers, software engineers, and researchers across architecture, planning, code review, and delivery; maintain 90-95% on-time delivery across AI engineering projects.</w:t>
+        <w:t>• Lead a multidisciplinary team of 15+ ML engineers, software engineers, and junior researchers, driving technical strategy, system architecture, engineering execution, quality standards, and cross-functional delivery.</w:t>
       </w:r>
     </w:p>
     <w:p>
@@ -253,7 +253,7 @@
           <w:color w:val="222222"/>
           <w:sz w:val="19"/>
         </w:rPr>
-        <w:t>• Oversee development of production AI systems across virtual try-on, generative media, 3D reconstruction, catalog audit, and audio QA.</w:t>
+        <w:t>• Lead the design, development, and deployment of scalable AI systems, translating product requirements into robust machine learning solutions.</w:t>
       </w:r>
     </w:p>
     <w:p>
@@ -268,7 +268,7 @@
           <w:color w:val="222222"/>
           <w:sz w:val="19"/>
         </w:rPr>
-        <w:t>• Direct applied research on AI hallucination, prompt safety, visual grounding, and video understanding.</w:t>
+        <w:t>• Direct applied research on AI hallucination, prompt safety, visual grounding, and video understanding, operationalizing research into production-ready models and evaluation frameworks.</w:t>
       </w:r>
     </w:p>
     <w:p>
@@ -283,7 +283,7 @@
           <w:color w:val="222222"/>
           <w:sz w:val="19"/>
         </w:rPr>
-        <w:t>• Develop and scale production segmentation and image-processing systems, including Retouched.ai; publish reproducible research code, datasets, and model artifacts on GitHub and Hugging Face.</w:t>
+        <w:t>• Develop and deploy deep learning–based computer vision and image-processing systems; publish reproducible code, datasets, and model checkpoints on GitHub and Hugging Face.</w:t>
       </w:r>
     </w:p>
     <w:p>
@@ -328,7 +328,7 @@
           <w:color w:val="222222"/>
           <w:sz w:val="19"/>
         </w:rPr>
-        <w:t>• Improved object detection and segmentation performance by 20-35% across internal evaluation benchmarks; the resulting models were later deployed through Retouched.ai.</w:t>
+        <w:t>• Improved object detection and segmentation performance by 20-35% across internal evaluation benchmarks; the resulting models were later deployed in Retouched.ai.</w:t>
       </w:r>
     </w:p>
     <w:p>
@@ -343,7 +343,7 @@
           <w:color w:val="222222"/>
           <w:sz w:val="19"/>
         </w:rPr>
-        <w:t>• Led 6+ client ML engagements from business requirements to technical delivery; built offline evaluation pipelines and production A/B testing workflows to validate model quality, inference performance, and production outcomes.</w:t>
+        <w:t>• Led 6+ client ML engagements from requirements gathering through production delivery; built offline evaluation pipelines and A/B testing workflows to validate model quality, inference performance, and business and operational outcomes.</w:t>
       </w:r>
     </w:p>
     <w:p>
@@ -388,7 +388,7 @@
           <w:color w:val="222222"/>
           <w:sz w:val="19"/>
         </w:rPr>
-        <w:t>• Built deep learning models for production object recognition, image segmentation, and background-removal workflows; developed scalable preprocessing, training, and A/B testing pipelines.</w:t>
+        <w:t>• Built deep learning models for object recognition, image segmentation, and background-removal workflows; developed scalable preprocessing, training, and A/B testing pipelines.</w:t>
       </w:r>
     </w:p>
     <w:p>
@@ -556,7 +556,7 @@
           <w:color w:val="222222"/>
           <w:sz w:val="19"/>
         </w:rPr>
-        <w:t>• Developed production salient-object segmentation for background removal; improved segmentation quality by 17% on internal benchmarks, reduced processing time by 30%, supported uploads up to 257 MB, and achieved a 2.27-second average processing time across standard production workloads.</w:t>
+        <w:t>• Developed salient-object segmentation for background removal; improved segmentation quality by 17% on internal benchmarks, reduced processing time by 30%, enabled uploads of up to 257 MB, and achieved a 2.27-second average processing time across standard workloads.</w:t>
       </w:r>
     </w:p>
     <w:p>
@@ -616,7 +616,7 @@
           <w:color w:val="222222"/>
           <w:sz w:val="19"/>
         </w:rPr>
-        <w:t>• Co-designed and launched production image- and video-generation APIs used across 200+ brands for creative and product-image workflows.</w:t>
+        <w:t>• Co-designed and launched image- and video-generation APIs used by 200+ brands for creative and product-image workflows.</w:t>
       </w:r>
     </w:p>
     <w:p>
@@ -631,14 +631,11 @@
           <w:color w:val="222222"/>
           <w:sz w:val="19"/>
         </w:rPr>
-        <w:t>• Built workflows for reference-image conditioning, asynchronous processing, prompt classification, intent routing, and automated model selection.</w:t>
+        <w:t>• Engineered workflows for reference-image conditioning, asynchronous processing, prompt classification, intent routing, and automated model selection.</w:t>
       </w:r>
     </w:p>
     <w:p>
       <w:pPr>
-        <w:tabs>
-          <w:tab w:pos="10080" w:val="right"/>
-        </w:tabs>
         <w:spacing w:before="80" w:after="20" w:line="264" w:lineRule="auto"/>
         <w:ind w:left="0" w:firstLine="0"/>
       </w:pPr>
@@ -649,19 +646,7 @@
           <w:color w:val="222222"/>
           <w:sz w:val="20"/>
         </w:rPr>
-        <w:t>The Fitting Room - Cross-Brand Virtual Try-On Platform</w:t>
-      </w:r>
-      <w:r>
-        <w:tab/>
-      </w:r>
-      <w:r>
-        <w:rPr>
-          <w:rFonts w:ascii="Calibri" w:hAnsi="Calibri" w:eastAsia="Calibri"/>
-          <w:b w:val="0"/>
-          <w:color w:val="5F6B75"/>
-          <w:sz w:val="18"/>
-        </w:rPr>
-        <w:t>In Development</w:t>
+        <w:t>The Fitting Room - Cross-Brand Virtual Try-On Platform (In development)</w:t>
       </w:r>
     </w:p>
     <w:p>
@@ -676,7 +661,7 @@
           <w:color w:val="222222"/>
           <w:sz w:val="19"/>
         </w:rPr>
-        <w:t>• Conceived and co-led a unified cross-brand virtual try-on platform covering 170+ brands.</w:t>
+        <w:t>• Conceived and co-led a unified cross-brand virtual try-on platform supporting products from 170+ brands.</w:t>
       </w:r>
     </w:p>
     <w:p>
@@ -696,9 +681,6 @@
     </w:p>
     <w:p>
       <w:pPr>
-        <w:tabs>
-          <w:tab w:pos="10080" w:val="right"/>
-        </w:tabs>
         <w:spacing w:before="80" w:after="20" w:line="264" w:lineRule="auto"/>
         <w:ind w:left="0" w:firstLine="0"/>
       </w:pPr>
@@ -709,19 +691,7 @@
           <w:color w:val="222222"/>
           <w:sz w:val="20"/>
         </w:rPr>
-        <w:t>Enterprise AI Catalog Audit and Image Quality Assurance Platform</w:t>
-      </w:r>
-      <w:r>
-        <w:tab/>
-      </w:r>
-      <w:r>
-        <w:rPr>
-          <w:rFonts w:ascii="Calibri" w:hAnsi="Calibri" w:eastAsia="Calibri"/>
-          <w:b w:val="0"/>
-          <w:color w:val="5F6B75"/>
-          <w:sz w:val="18"/>
-        </w:rPr>
-        <w:t>In Development</w:t>
+        <w:t>Enterprise AI Catalog Audit and Image Quality Assurance Platform (In development)</w:t>
       </w:r>
     </w:p>
     <w:p>
@@ -736,7 +706,7 @@
           <w:color w:val="222222"/>
           <w:sz w:val="19"/>
         </w:rPr>
-        <w:t>• Lead development of an AI catalog-audit and image quality assurance platform for a major US retail client.</w:t>
+        <w:t>• Leading the development of an AI catalog-audit and image quality assurance platform for a major US retail client.</w:t>
       </w:r>
     </w:p>
     <w:p>
@@ -751,14 +721,11 @@
           <w:color w:val="222222"/>
           <w:sz w:val="19"/>
         </w:rPr>
-        <w:t>• Automate image QA, catalog validation, metadata checks, and content-health monitoring across DAM and CMS workflows using computer vision, NLP, PyTorch, and FastAPI.</w:t>
+        <w:t>• Automating image QA, catalog validation, metadata checks, and content-health monitoring across DAM and CMS workflows using NLP, PyTorch, and FastAPI.</w:t>
       </w:r>
     </w:p>
     <w:p>
       <w:pPr>
-        <w:tabs>
-          <w:tab w:pos="10080" w:val="right"/>
-        </w:tabs>
         <w:spacing w:before="80" w:after="20" w:line="264" w:lineRule="auto"/>
         <w:ind w:left="0" w:firstLine="0"/>
       </w:pPr>
@@ -769,19 +736,7 @@
           <w:color w:val="222222"/>
           <w:sz w:val="20"/>
         </w:rPr>
-        <w:t>CogniX - Proprietary Multimodal Image Generation and Editing</w:t>
-      </w:r>
-      <w:r>
-        <w:tab/>
-      </w:r>
-      <w:r>
-        <w:rPr>
-          <w:rFonts w:ascii="Calibri" w:hAnsi="Calibri" w:eastAsia="Calibri"/>
-          <w:b w:val="0"/>
-          <w:color w:val="5F6B75"/>
-          <w:sz w:val="18"/>
-        </w:rPr>
-        <w:t>Active R&amp;D</w:t>
+        <w:t>CogniX - Proprietary Multimodal Content Creation Platform (Active R&amp;D)</w:t>
       </w:r>
     </w:p>
     <w:p>
@@ -796,7 +751,7 @@
           <w:color w:val="222222"/>
           <w:sz w:val="19"/>
         </w:rPr>
-        <w:t>• Leading early-stage R&amp;D for a proprietary multimodal image-generation and editing system for product-visualization workflows.</w:t>
+        <w:t>• Leading early-stage R&amp;D for multimodal product-visualization and editing workflows.</w:t>
       </w:r>
     </w:p>
     <w:p>
@@ -811,7 +766,7 @@
           <w:color w:val="222222"/>
           <w:sz w:val="19"/>
         </w:rPr>
-        <w:t>• Researching and prototyping multi-reference fusion and prompt-guided image-editing workflows for garment replacement, scene composition, product visualization, and style transfer using PyTorch, Diffusers, ComfyUI, and parameter-efficient fine-tuning (LoRA, QLoRA).</w:t>
+        <w:t>• Researching and prototyping multi-reference fusion and editing workflows for garment replacement, scene composition, product visualization, and style transfer using PyTorch, Diffusers, ComfyUI, and parameter-efficient fine-tuning (LoRA, QLoRA).</w:t>
       </w:r>
     </w:p>
     <w:p>
@@ -850,6 +805,21 @@
           <w:sz w:val="19"/>
         </w:rPr>
         <w:t>[P1] Abdullah Ibne Hanif Arean, Niamul Hassan Samin, Md Arifur Rahman, Renu Akter Sweety, Juena Ahmed Noshin, Md Ashikur Rahman*. "Stroke-Level Connectivity Verification: Grounding Vision-Language Models Against Topology Hallucination in Diagram Understanding." International Conference on Document Analysis and Recognition (ICDAR), 2026. Accepted for oral presentation. *Corresponding author. [Code]</w:t>
+      </w:r>
+    </w:p>
+    <w:p>
+      <w:pPr>
+        <w:spacing w:before="0" w:after="40" w:line="276" w:lineRule="auto"/>
+        <w:ind w:left="0" w:firstLine="0"/>
+      </w:pPr>
+      <w:r>
+        <w:rPr>
+          <w:rFonts w:ascii="Calibri" w:hAnsi="Calibri" w:eastAsia="Calibri"/>
+          <w:b w:val="0"/>
+          <w:color w:val="222222"/>
+          <w:sz w:val="19"/>
+        </w:rPr>
+        <w:t>[P2] Juena Noshin, Kawser Irom Rushee, Mohammad Rabiul Islam, Sifat Rahman Ahona, Md Ashikur Rahman. "UCAR: Uncertainty-Calibrated Adaptive Retrieval for Hallucination Reduction in Medical Vision-Language Models." International Conference on Computing Advancements (ICCA), 2026.</w:t>
       </w:r>
     </w:p>
     <w:p>
@@ -912,7 +882,22 @@
           <w:color w:val="222222"/>
           <w:sz w:val="19"/>
         </w:rPr>
-        <w:t>[M3] Md Ashikur Rahman, Md Arifur Rahman, Nusrat Jahan Trisna, Juena Ahmed Noshin. "Math-Encoded Jailbreaks Across Provider-Matched Models and Inference-Time Reasoning Configurations." Manuscript under review, 2026.</w:t>
+        <w:t>[M3] Md Ashikur Rahman, Md Arifur Rahman, Nusrat Jahan Trisna, Juena Ahmed Noshin. "Decoding Harm: Do Reasoning Models Resist Math-Encoded Jailbreaks?" Manuscript under review, 2026.</w:t>
+      </w:r>
+    </w:p>
+    <w:p>
+      <w:pPr>
+        <w:spacing w:before="0" w:after="40" w:line="276" w:lineRule="auto"/>
+        <w:ind w:left="0" w:firstLine="0"/>
+      </w:pPr>
+      <w:r>
+        <w:rPr>
+          <w:rFonts w:ascii="Calibri" w:hAnsi="Calibri" w:eastAsia="Calibri"/>
+          <w:b w:val="0"/>
+          <w:color w:val="222222"/>
+          <w:sz w:val="19"/>
+        </w:rPr>
+        <w:t>[M4] Niamul Hassan Samin, Abdullah Ibne Hanif Arean, Md Arifur Rahman, Md Hasibul Amin, Renu Akter Suity, Juena Ahmed Noshin, Md Ashikur Rahman. "Residual Stream Rebalancing: Training-Free Hallucination Mitigation in Vision-Language Models." Manuscript under review, 2026.</w:t>
       </w:r>
     </w:p>
     <w:p>
@@ -945,7 +930,7 @@
           <w:color w:val="222222"/>
           <w:sz w:val="19"/>
         </w:rPr>
-        <w:t>[A1] "Automated Detection of Diabetic Retinopathy Using Deep Residual Learning." International Journal of Computer Applications, 2020.</w:t>
+        <w:t>[A1] &lt;b&gt;Md Ashikur Rahman&lt;/b&gt;, Md Arifur Rahman, Juena Ahmed Noshin. "Automated Detection of Diabetic Retinopathy Using Deep Residual Learning." International Journal of Computer Applications, 2020.</w:t>
       </w:r>
     </w:p>
     <w:p>
@@ -1150,7 +1135,7 @@
           <w:color w:val="222222"/>
           <w:sz w:val="19"/>
         </w:rPr>
-        <w:t>Diffusion Models, Large Language Models (Llama, Qwen), Prompt Safety, Parameter-Efficient Fine-Tuning (LoRA, QLoRA), Prompt-Guided Image Editing</w:t>
+        <w:t>Diffusion Models, Large Language Models (including Llama and Qwen), Prompt Safety, Parameter-Efficient Fine-Tuning (LoRA, QLoRA)</w:t>
       </w:r>
     </w:p>
     <w:p>
@@ -1219,7 +1204,7 @@
           <w:color w:val="222222"/>
           <w:sz w:val="19"/>
         </w:rPr>
-        <w:t>Model Serving, Production Deployment, Offline Evaluation, Production A/B Testing, Model Evaluation, Dataset Design</w:t>
+        <w:t>Model Serving, Deployment, Offline and Online Evaluation, A/B Testing, Dataset Design</w:t>
       </w:r>
     </w:p>
     <w:p>

</xml_diff>